<commit_message>
Privacy policy, DPA, terms, FAQ and help: the new emails, consents and unsubscribing
What's stored (email settings and their log, candidates' opt-outs as a hash, the sent log),
the basis of each email type (service, digest and reminders, soft opt-in updates, consented
offers), how long each is kept, and how to stop them; candidates' opt-out links in the DPA
and the company documents; a new FAQ answer in all 23 languages.

Co-Authored-By: Claude Opus 5.5 <noreply@anthropic.com>
</commit_message>
<xml_diff>
--- a/frontend/public/documents/prepza-candidate-notice-templates.docx
+++ b/frontend/public/documents/prepza-candidate-notice-templates.docx
@@ -16,7 +16,7 @@
         <w:pStyle w:val="FirstParagraph"/>
       </w:pPr>
       <w:r>
-        <w:t xml:space="preserve">Version: 2026-10-06</w:t>
+        <w:t xml:space="preserve">Version: 2026-10-08</w:t>
       </w:r>
       <w:r>
         <w:br/>
@@ -584,6 +584,30 @@
       </w:r>
       <w:r>
         <w:t xml:space="preserve">authority. prepza’s privacy policy: https://prepza.ai/privacy.</w:t>
+      </w:r>
+    </w:p>
+    <w:p>
+      <w:pPr>
+        <w:pStyle w:val="BlockText"/>
+      </w:pPr>
+      <w:r>
+        <w:rPr>
+          <w:b/>
+          <w:bCs/>
+        </w:rPr>
+        <w:t xml:space="preserve">Emails.</w:t>
+      </w:r>
+      <w:r>
+        <w:t xml:space="preserve"> </w:t>
+      </w:r>
+      <w:r>
+        <w:t xml:space="preserve">prepza sends your invitation and reminders for us. Each has a link to stop our emails</w:t>
+      </w:r>
+      <w:r>
+        <w:t xml:space="preserve"> </w:t>
+      </w:r>
+      <w:r>
+        <w:t xml:space="preserve">through prepza, or that test’s reminders.</w:t>
       </w:r>
     </w:p>
     <w:p>

</xml_diff>

<commit_message>
Documents: the downloadable DPA says what the website's does (AI apps, the assistant and what OpenAI keeps), a test keeps them in step, and the PDFs and Word templates are rebuilt
Co-Authored-By: Claude Opus 5.5 <noreply@anthropic.com>
</commit_message>
<xml_diff>
--- a/frontend/public/documents/prepza-candidate-notice-templates.docx
+++ b/frontend/public/documents/prepza-candidate-notice-templates.docx
@@ -258,13 +258,13 @@
         <w:t xml:space="preserve"> </w:t>
       </w:r>
       <w:r>
-        <w:t xml:space="preserve">The tool uses only your email address, the name and account id from your sign-in, and</w:t>
-      </w:r>
-      <w:r>
-        <w:t xml:space="preserve"> </w:t>
-      </w:r>
-      <w:r>
-        <w:t xml:space="preserve">your answers in the test. The questions were written with AI from the job description and</w:t>
+        <w:t xml:space="preserve">The tool uses only your email address, your name (from your application or your</w:t>
+      </w:r>
+      <w:r>
+        <w:t xml:space="preserve"> </w:t>
+      </w:r>
+      <w:r>
+        <w:t xml:space="preserve">sign-in), the account id from your sign-in, and your answers in the test. The questions were written with AI from the job description and</w:t>
       </w:r>
       <w:r>
         <w:t xml:space="preserve"> </w:t>

</xml_diff>

<commit_message>
Legal documents: the instructions for companies, candidate notices and DPIA template are final (declared accuracy, deployers' duties, high-risk status), and the privacy policy and DPA name Google Workspace, prepza's inbox
Co-Authored-By: Claude Opus 5.5 <noreply@anthropic.com>
</commit_message>
<xml_diff>
--- a/frontend/public/documents/prepza-candidate-notice-templates.docx
+++ b/frontend/public/documents/prepza-candidate-notice-templates.docx
@@ -16,13 +16,7 @@
         <w:pStyle w:val="FirstParagraph"/>
       </w:pPr>
       <w:r>
-        <w:t xml:space="preserve">Version: 2026-10-08</w:t>
-      </w:r>
-      <w:r>
-        <w:br/>
-      </w:r>
-      <w:r>
-        <w:t xml:space="preserve">Operator: Arcolabs OÜ (registry code 17587452), Sepapaja tn 6, 15551 Tallinn, Harju maakond, Estonia; hello@prepza.ai</w:t>
+        <w:t xml:space="preserve">Version of 2026-10-14. Arcolabs OÜ (registry code 17587452), Sepapaja tn 6, 15551 Tallinn, Estonia; hello@prepza.ai.</w:t>
       </w:r>
     </w:p>
     <w:p>
@@ -52,7 +46,25 @@
         <w:t xml:space="preserve"> </w:t>
       </w:r>
       <w:r>
-        <w:t xml:space="preserve">everything in [brackets], and check the result with your own legal adviser for your jurisdiction.</w:t>
+        <w:t xml:space="preserve">everything in [brackets]. The notice is yours to give as the employer: these templates cover what</w:t>
+      </w:r>
+      <w:r>
+        <w:t xml:space="preserve"> </w:t>
+      </w:r>
+      <w:r>
+        <w:t xml:space="preserve">prepza does, and you add how you use the results. In the EU, telling candidates that a high-risk</w:t>
+      </w:r>
+      <w:r>
+        <w:t xml:space="preserve"> </w:t>
+      </w:r>
+      <w:r>
+        <w:t xml:space="preserve">AI system is used to assess them is one of your duties under the AI Act from 2027-12-02; the</w:t>
+      </w:r>
+      <w:r>
+        <w:t xml:space="preserve"> </w:t>
+      </w:r>
+      <w:r>
+        <w:t xml:space="preserve">general notice (section 2) does it.</w:t>
       </w:r>
     </w:p>
     <w:bookmarkStart w:id="9" w:name="X326a768412094e7498f210d3703b6e2890fc1af"/>
@@ -123,13 +135,31 @@
         <w:pStyle w:val="BodyText"/>
       </w:pPr>
       <w:r>
-        <w:t xml:space="preserve">prepza has not yet published a bias audit summary. Until it does, don’t use prepza for candidates</w:t>
-      </w:r>
-      <w:r>
-        <w:t xml:space="preserve"> </w:t>
-      </w:r>
-      <w:r>
-        <w:t xml:space="preserve">in New York City (see prepza’s instructions for companies).</w:t>
+        <w:t xml:space="preserve">Under Local Law 144 the employer or employment agency commissions the bias audit and gives the</w:t>
+      </w:r>
+      <w:r>
+        <w:t xml:space="preserve"> </w:t>
+      </w:r>
+      <w:r>
+        <w:t xml:space="preserve">notice: prepza doesn’t do it for you. prepza gives you the candidates’ results for your auditor</w:t>
+      </w:r>
+      <w:r>
+        <w:t xml:space="preserve"> </w:t>
+      </w:r>
+      <w:r>
+        <w:t xml:space="preserve">(API, PDF reports), the summary of its own independent bias audit once published at</w:t>
+      </w:r>
+      <w:r>
+        <w:t xml:space="preserve"> </w:t>
+      </w:r>
+      <w:r>
+        <w:t xml:space="preserve">prepza.ai/documents, and this template. Don’t use prepza for candidates in New York City before</w:t>
+      </w:r>
+      <w:r>
+        <w:t xml:space="preserve"> </w:t>
+      </w:r>
+      <w:r>
+        <w:t xml:space="preserve">your audit summary is published (see prepza’s instructions for companies).</w:t>
       </w:r>
     </w:p>
     <w:p>
@@ -264,13 +294,19 @@
         <w:t xml:space="preserve"> </w:t>
       </w:r>
       <w:r>
-        <w:t xml:space="preserve">sign-in), the account id from your sign-in, and your answers in the test. The questions were written with AI from the job description and</w:t>
-      </w:r>
-      <w:r>
-        <w:t xml:space="preserve"> </w:t>
-      </w:r>
-      <w:r>
-        <w:t xml:space="preserve">reviewed by [Company]. Your test data is kept by prepza for 12 months after your invitation, then</w:t>
+        <w:t xml:space="preserve">sign-in), the account id from your sign-in, and your answers in the test, with how long each</w:t>
+      </w:r>
+      <w:r>
+        <w:t xml:space="preserve"> </w:t>
+      </w:r>
+      <w:r>
+        <w:t xml:space="preserve">took, page leaves and copy attempts. The questions were written with AI from the job description,</w:t>
+      </w:r>
+      <w:r>
+        <w:t xml:space="preserve"> </w:t>
+      </w:r>
+      <w:r>
+        <w:t xml:space="preserve">on topics [Company] chose. Your test data is kept by prepza for 12 months after your invitation, then</w:t>
       </w:r>
       <w:r>
         <w:t xml:space="preserve"> </w:t>
@@ -312,7 +348,7 @@
         <w:t xml:space="preserve"> </w:t>
       </w:r>
       <w:r>
-        <w:t xml:space="preserve">the bias audit summary].</w:t>
+        <w:t xml:space="preserve">your bias audit summary].</w:t>
       </w:r>
     </w:p>
     <w:p>
@@ -421,19 +457,25 @@
         <w:t xml:space="preserve"> </w:t>
       </w:r>
       <w:r>
-        <w:t xml:space="preserve">[N] multiple-choice questions about [topics], with [N] seconds for each. Questions</w:t>
-      </w:r>
-      <w:r>
-        <w:t xml:space="preserve"> </w:t>
-      </w:r>
-      <w:r>
-        <w:t xml:space="preserve">were written with the help of AI from the job description and reviewed by our team. Each</w:t>
-      </w:r>
-      <w:r>
-        <w:t xml:space="preserve"> </w:t>
-      </w:r>
-      <w:r>
-        <w:t xml:space="preserve">candidate gets their own selection of questions. You can change your pick until you move to the</w:t>
+        <w:t xml:space="preserve">An AI system that helps us assess candidates; under the EU AI Act it counts as a</w:t>
+      </w:r>
+      <w:r>
+        <w:t xml:space="preserve"> </w:t>
+      </w:r>
+      <w:r>
+        <w:t xml:space="preserve">high-risk AI system. [N] multiple-choice questions about [topics], with [N] seconds for each.</w:t>
+      </w:r>
+      <w:r>
+        <w:t xml:space="preserve"> </w:t>
+      </w:r>
+      <w:r>
+        <w:t xml:space="preserve">Questions were written with the help of AI from the job description, on topics our team chose.</w:t>
+      </w:r>
+      <w:r>
+        <w:t xml:space="preserve"> </w:t>
+      </w:r>
+      <w:r>
+        <w:t xml:space="preserve">Each candidate gets their own selection of questions. You can change your pick until you move to the</w:t>
       </w:r>
       <w:r>
         <w:t xml:space="preserve"> </w:t>
@@ -535,7 +577,13 @@
         <w:t xml:space="preserve"> </w:t>
       </w:r>
       <w:r>
-        <w:t xml:space="preserve">You don’t need to tell us a diagnosis.</w:t>
+        <w:t xml:space="preserve">If you apply through our job ad’s link, ask us for a personal invite first: extra time can’t be</w:t>
+      </w:r>
+      <w:r>
+        <w:t xml:space="preserve"> </w:t>
+      </w:r>
+      <w:r>
+        <w:t xml:space="preserve">added there. You don’t need to tell us a diagnosis.</w:t>
       </w:r>
     </w:p>
     <w:p>
@@ -655,7 +703,7 @@
         <w:t xml:space="preserve"> </w:t>
       </w:r>
       <w:r>
-        <w:t xml:space="preserve">AI-assisted and reviewed by our team; a person reviews every result and you can ask for a human</w:t>
+        <w:t xml:space="preserve">AI-written on topics our team chose; a person reviews every result and you can ask for a human</w:t>
       </w:r>
       <w:r>
         <w:t xml:space="preserve"> </w:t>

</xml_diff>

<commit_message>
Complete what the candidate notices say is recorded
The notice templates companies give candidates left out two things
prepza records: answers given too fast to have read the question, and
extra time a company gives. The New York City notice also said the
tool uses "only" the data it listed. Both notices now list all of it
(review L11).

Co-Authored-By: Claude Opus 5.5 <noreply@anthropic.com>
</commit_message>
<xml_diff>
--- a/frontend/public/documents/prepza-candidate-notice-templates.docx
+++ b/frontend/public/documents/prepza-candidate-notice-templates.docx
@@ -16,7 +16,7 @@
         <w:pStyle w:val="FirstParagraph"/>
       </w:pPr>
       <w:r>
-        <w:t xml:space="preserve">Version of 2026-10-14. Arcolabs OÜ (registry code 17587452), Sepapaja tn 6, 15551 Tallinn, Estonia; hello@prepza.ai.</w:t>
+        <w:t xml:space="preserve">Version of 2026-10-16. Arcolabs OÜ (registry code 17587452), Sepapaja tn 6, 15551 Tallinn, Estonia; hello@prepza.ai.</w:t>
       </w:r>
     </w:p>
     <w:p>
@@ -240,7 +240,13 @@
         <w:t xml:space="preserve"> </w:t>
       </w:r>
       <w:r>
-        <w:t xml:space="preserve">took, and when you left the test page or copied text during it.</w:t>
+        <w:t xml:space="preserve">took, when you left the test page or copied text during it, and answers given too fast to have</w:t>
+      </w:r>
+      <w:r>
+        <w:t xml:space="preserve"> </w:t>
+      </w:r>
+      <w:r>
+        <w:t xml:space="preserve">read the question; [Company] may give you extra time, which is recorded without a reason.</w:t>
       </w:r>
     </w:p>
     <w:p>
@@ -288,19 +294,25 @@
         <w:t xml:space="preserve"> </w:t>
       </w:r>
       <w:r>
-        <w:t xml:space="preserve">The tool uses only your email address, your name (from your application or your</w:t>
-      </w:r>
-      <w:r>
-        <w:t xml:space="preserve"> </w:t>
-      </w:r>
-      <w:r>
-        <w:t xml:space="preserve">sign-in), the account id from your sign-in, and your answers in the test, with how long each</w:t>
-      </w:r>
-      <w:r>
-        <w:t xml:space="preserve"> </w:t>
-      </w:r>
-      <w:r>
-        <w:t xml:space="preserve">took, page leaves and copy attempts. The questions were written with AI from the job description,</w:t>
+        <w:t xml:space="preserve">The tool uses your email address, your name (from your application or your sign-in),</w:t>
+      </w:r>
+      <w:r>
+        <w:t xml:space="preserve"> </w:t>
+      </w:r>
+      <w:r>
+        <w:t xml:space="preserve">the account id from your sign-in, and your answers in the test, with how long each took, page</w:t>
+      </w:r>
+      <w:r>
+        <w:t xml:space="preserve"> </w:t>
+      </w:r>
+      <w:r>
+        <w:t xml:space="preserve">leaves, copy attempts, answers too fast to have read the question, and any extra time you were</w:t>
+      </w:r>
+      <w:r>
+        <w:t xml:space="preserve"> </w:t>
+      </w:r>
+      <w:r>
+        <w:t xml:space="preserve">given. The questions were written with AI from the job description,</w:t>
       </w:r>
       <w:r>
         <w:t xml:space="preserve"> </w:t>
@@ -505,13 +517,19 @@
         <w:t xml:space="preserve"> </w:t>
       </w:r>
       <w:r>
-        <w:t xml:space="preserve">Your answers, whether each was right, how long each took, and when you left</w:t>
-      </w:r>
-      <w:r>
-        <w:t xml:space="preserve"> </w:t>
-      </w:r>
-      <w:r>
-        <w:t xml:space="preserve">the test page or copied text. You won’t see your score.</w:t>
+        <w:t xml:space="preserve">Your answers, whether each was right, how long each took, when you left the</w:t>
+      </w:r>
+      <w:r>
+        <w:t xml:space="preserve"> </w:t>
+      </w:r>
+      <w:r>
+        <w:t xml:space="preserve">test page or copied text, and answers given too fast to have read the question. If we give you</w:t>
+      </w:r>
+      <w:r>
+        <w:t xml:space="preserve"> </w:t>
+      </w:r>
+      <w:r>
+        <w:t xml:space="preserve">extra time, that is recorded too, without a reason. You won’t see your score.</w:t>
       </w:r>
     </w:p>
     <w:p>

</xml_diff>

<commit_message>
Build the approved screens on the frontend
Adds the screens approved in review: key permissions, campaigns with a
text editor, AI costs and editable values in Controls, the action log,
multi-answer questions with their tag and partial points, the MCP docs
tab, a shared code editor with colours, the interview start page with
the whole interview's time, and the questions and stats sub-tabs.

Co-Authored-By: Claude Opus 5.5 <noreply@anthropic.com>
</commit_message>
<xml_diff>
--- a/frontend/public/documents/prepza-candidate-notice-templates.docx
+++ b/frontend/public/documents/prepza-candidate-notice-templates.docx
@@ -16,7 +16,7 @@
         <w:pStyle w:val="FirstParagraph"/>
       </w:pPr>
       <w:r>
-        <w:t xml:space="preserve">Version of 2026-10-16. Arcolabs OÜ (registry code 17587452), Sepapaja tn 6, 15551 Tallinn, Estonia; hello@prepza.ai.</w:t>
+        <w:t xml:space="preserve">Version of 2026-10-17. Arcolabs OÜ (registry code 17587452), Sepapaja tn 6, 15551 Tallinn, Estonia; hello@prepza.ai.</w:t>
       </w:r>
     </w:p>
     <w:p>
@@ -234,7 +234,31 @@
         <w:t xml:space="preserve"> </w:t>
       </w:r>
       <w:r>
-        <w:t xml:space="preserve">is the percentage of questions answered correctly. The tool also records how long each answer</w:t>
+        <w:t xml:space="preserve">is the percentage of points earned: each question is worth one point, and on a</w:t>
+      </w:r>
+      <w:r>
+        <w:t xml:space="preserve"> </w:t>
+      </w:r>
+      <w:r>
+        <w:t xml:space="preserve">“select all that</w:t>
+      </w:r>
+      <w:r>
+        <w:t xml:space="preserve"> </w:t>
+      </w:r>
+      <w:r>
+        <w:t xml:space="preserve">apply”</w:t>
+      </w:r>
+      <w:r>
+        <w:t xml:space="preserve"> </w:t>
+      </w:r>
+      <w:r>
+        <w:t xml:space="preserve">question you earn part of it for each right option ticked, and nothing if you tick a</w:t>
+      </w:r>
+      <w:r>
+        <w:t xml:space="preserve"> </w:t>
+      </w:r>
+      <w:r>
+        <w:t xml:space="preserve">wrong one. The tool also records how long each answer</w:t>
       </w:r>
       <w:r>
         <w:t xml:space="preserve"> </w:t>
@@ -487,19 +511,43 @@
         <w:t xml:space="preserve"> </w:t>
       </w:r>
       <w:r>
-        <w:t xml:space="preserve">Each candidate gets their own selection of questions. You can change your pick until you move to the</w:t>
-      </w:r>
-      <w:r>
-        <w:t xml:space="preserve"> </w:t>
-      </w:r>
-      <w:r>
-        <w:t xml:space="preserve">next question or finish. When a question’s time runs out, your pick counts; with no pick, it</w:t>
-      </w:r>
-      <w:r>
-        <w:t xml:space="preserve"> </w:t>
-      </w:r>
-      <w:r>
-        <w:t xml:space="preserve">counts as wrong.</w:t>
+        <w:t xml:space="preserve">Each candidate gets their own selection of questions. Most have one right option; a</w:t>
+      </w:r>
+      <w:r>
+        <w:t xml:space="preserve"> </w:t>
+      </w:r>
+      <w:r>
+        <w:t xml:space="preserve">“select all</w:t>
+      </w:r>
+      <w:r>
+        <w:t xml:space="preserve"> </w:t>
+      </w:r>
+      <w:r>
+        <w:t xml:space="preserve">that apply”</w:t>
+      </w:r>
+      <w:r>
+        <w:t xml:space="preserve"> </w:t>
+      </w:r>
+      <w:r>
+        <w:t xml:space="preserve">question has 2 or 3, and you tick every one you think is right: it earns part of its</w:t>
+      </w:r>
+      <w:r>
+        <w:t xml:space="preserve"> </w:t>
+      </w:r>
+      <w:r>
+        <w:t xml:space="preserve">point for each right option ticked, and nothing if a wrong one is ticked. You can change your pick</w:t>
+      </w:r>
+      <w:r>
+        <w:t xml:space="preserve"> </w:t>
+      </w:r>
+      <w:r>
+        <w:t xml:space="preserve">until you move to the next question or finish. When a question’s time runs out, your pick</w:t>
+      </w:r>
+      <w:r>
+        <w:t xml:space="preserve"> </w:t>
+      </w:r>
+      <w:r>
+        <w:t xml:space="preserve">counts; with no pick, it counts as wrong.</w:t>
       </w:r>
     </w:p>
     <w:p>
@@ -517,19 +565,25 @@
         <w:t xml:space="preserve"> </w:t>
       </w:r>
       <w:r>
-        <w:t xml:space="preserve">Your answers, whether each was right, how long each took, when you left the</w:t>
-      </w:r>
-      <w:r>
-        <w:t xml:space="preserve"> </w:t>
-      </w:r>
-      <w:r>
-        <w:t xml:space="preserve">test page or copied text, and answers given too fast to have read the question. If we give you</w:t>
-      </w:r>
-      <w:r>
-        <w:t xml:space="preserve"> </w:t>
-      </w:r>
-      <w:r>
-        <w:t xml:space="preserve">extra time, that is recorded too, without a reason. You won’t see your score.</w:t>
+        <w:t xml:space="preserve">Your answers (every option ticked), whether each was right or the points</w:t>
+      </w:r>
+      <w:r>
+        <w:t xml:space="preserve"> </w:t>
+      </w:r>
+      <w:r>
+        <w:t xml:space="preserve">it earned, how long each took, when you left the test page or copied text, and answers given</w:t>
+      </w:r>
+      <w:r>
+        <w:t xml:space="preserve"> </w:t>
+      </w:r>
+      <w:r>
+        <w:t xml:space="preserve">too fast to have read the question. If we give you extra time, that is recorded too, without a</w:t>
+      </w:r>
+      <w:r>
+        <w:t xml:space="preserve"> </w:t>
+      </w:r>
+      <w:r>
+        <w:t xml:space="preserve">reason. You won’t see your score.</w:t>
       </w:r>
     </w:p>
     <w:p>

</xml_diff>